<commit_message>
fix(docs): update Chapter 1 draft with corrected terminology
</commit_message>
<xml_diff>
--- a/docs/F2_Diploma_Chapter1_Brenkach.docx
+++ b/docs/F2_Diploma_Chapter1_Brenkach.docx
@@ -1415,7 +1415,7 @@
               <w:rPr>
                 <w:sz w:val="20"/>
               </w:rPr>
-              <w:t xml:space="preserve">Єдина (WSGI і воркери Celery)</w:t>
+              <w:t xml:space="preserve">Єдина (WSGI і worker-процеси Celery)</w:t>
             </w:r>
           </w:p>
         </w:tc>
@@ -1877,7 +1877,7 @@
               <w:rPr>
                 <w:sz w:val="20"/>
               </w:rPr>
-              <w:t xml:space="preserve">Асинхронно, воркери Celery</w:t>
+              <w:t xml:space="preserve">Асинхронно, worker-процеси Celery</w:t>
             </w:r>
           </w:p>
         </w:tc>
@@ -2421,7 +2421,7 @@
         <w:pStyle w:val="BodyText"/>
       </w:pPr>
       <w:r>
-        <w:t xml:space="preserve">Другим системним чинником є розподіл даних між кількома сховищами з узгодженістю в кінцевому підсумку (eventual consistency). Поліглотне зберігання TaskRabbit (MySQL, PostgreSQL, Snowflake) та Thumbtack (PostgreSQL, DynamoDB, Elasticsearch, BigQuery) унеможливлює ACID-транзакції між доменами й переносить забезпечення цілісності на рівень прикладної логіки. Третім чинником є виконання обчислювально важких операцій у синхронному циклі HTTP-запиту. У Kabanchik.ua до таких операцій належать ранжування виконавців за геолокацією та аналіз фотографій [8], через що час відповіді й пропускна здатність WSGI-воркерів залежать від тривалості обчислень. Вартість супроводу додатково підвищують співіснування двох моделей виконання (WSGI та asyncio) і застарілий стек: CoffeeScript та Python 3.6, підтримку якого припинено у грудні 2021 р.</w:t>
+        <w:t xml:space="preserve">Другим системним чинником є розподіл даних між кількома сховищами з узгодженістю в кінцевому підсумку (eventual consistency). Поліглотне зберігання TaskRabbit (MySQL, PostgreSQL, Snowflake) та Thumbtack (PostgreSQL, DynamoDB, Elasticsearch, BigQuery) унеможливлює ACID-транзакції між доменами й переносить забезпечення цілісності на рівень прикладної логіки. Третім чинником є виконання обчислювально важких операцій у синхронному циклі HTTP-запиту. У Kabanchik.ua до таких операцій належать ранжування виконавців за геолокацією та аналіз фотографій [8], через що час відповіді й пропускна здатність WSGI worker-процесів залежать від тривалості обчислень. Вартість супроводу додатково підвищують співіснування двох моделей виконання (WSGI та asyncio) і застарілий стек: CoffeeScript та Python 3.6, підтримку якого припинено у грудні 2021 р.</w:t>
       </w:r>
     </w:p>
     <w:p>
@@ -2437,7 +2437,7 @@
         <w:pStyle w:val="BodyText"/>
       </w:pPr>
       <w:r>
-        <w:t xml:space="preserve">Архітектура проєкту «Сусід» усуває виявлені причини, зберігаючи монолітну структуру. Модульний моноліт на Python/Flask з явними межами доменних модулів забезпечує єдину модель виконання та єдиний процес розгортання й водночас зберігає можливість виокремити модулі в сервіси за обґрунтованої потреби. PostgreSQL як єдине джерело істини дає змогу виконувати зміни доменного стану в межах однієї ACID-транзакції, а похідні дані (рейтинги, результати аналізу зображень, векторні представлення) є відновлюваними. Патерн Transactional Outbox усуває проблему подвійного запису: подія фіксується в таблиці outbox у тій самій транзакції, що й бізнес-зміна, а окремий ретранслятор публікує її до брокера, що забезпечує семантику доставки «щонайменше один раз» за умови ідемпотентності обробників. Перерахунок рейтингу та аналіз фотографій винесено в асинхронні воркери Celery, тому час відповіді REST API не залежить від тривалості обчислень; розподіл задач за окремими чергами обмежує вплив збою ML-задач на обслуговування запитів. Локальне виконання відкритих моделей усуває залежність від API керованих хмарних сервісів, а Telegram-бот реалізовано як окремий клієнт REST API, тож його збій не впливає на ядро системи.</w:t>
+        <w:t xml:space="preserve">Архітектура проєкту «Сусід» усуває виявлені причини, зберігаючи монолітну структуру. Модульний моноліт на Python/Flask з явними межами доменних модулів забезпечує єдину модель виконання та єдиний процес розгортання й водночас зберігає можливість виокремити модулі в сервіси за обґрунтованої потреби. PostgreSQL як єдине джерело істини дає змогу виконувати зміни доменного стану в межах однієї ACID-транзакції, а похідні дані (рейтинги, результати аналізу зображень, векторні представлення) є відновлюваними. Патерн Transactional Outbox усуває проблему подвійного запису: подія фіксується в таблиці outbox у тій самій транзакції, що й бізнес-зміна, а окремий ретранслятор публікує її до брокера, що забезпечує семантику доставки «щонайменше один раз» за умови ідемпотентності обробників. Перерахунок рейтингу та аналіз фотографій винесено в асинхронні worker-процеси Celery, тому час відповіді REST API не залежить від тривалості обчислень; розподіл задач за окремими чергами обмежує вплив збою ML-задач на обслуговування запитів. Локальне виконання відкритих моделей усуває залежність від API керованих хмарних сервісів, а Telegram-бот реалізовано як окремий клієнт REST API, тож його збій не впливає на ядро системи.</w:t>
       </w:r>
     </w:p>
     <w:p>
@@ -2481,7 +2481,7 @@
         <w:pStyle w:val="Compact"/>
       </w:pPr>
       <w:r>
-        <w:t xml:space="preserve">Локальні ML-моделі конкурують з іншими компонентами за обчислювальні ресурси вузла, що потребує обмеження паралелізму воркерів.</w:t>
+        <w:t xml:space="preserve">Локальні ML-моделі конкурують з іншими компонентами за обчислювальні ресурси вузла, що потребує обмеження паралелізму worker-процесів.</w:t>
       </w:r>
     </w:p>
     <w:p>
@@ -4299,7 +4299,7 @@
               <w:rPr>
                 <w:sz w:val="20"/>
               </w:rPr>
-              <w:t xml:space="preserve">Transactional Outbox, асинхронні воркери Celery</w:t>
+              <w:t xml:space="preserve">Transactional Outbox, асинхронні worker-процеси Celery</w:t>
             </w:r>
           </w:p>
         </w:tc>
@@ -4568,7 +4568,7 @@
         <w:t xml:space="preserve"> </w:t>
       </w:r>
       <w:r>
-        <w:t xml:space="preserve">Замовник описує проблему й додає фотографії. Метадані EXIF видаляються перед збереженням. Асинхронний воркер визначає тип несправності та формує підказку: перелік матеріалів та інструментів. Підказка відображається майстру в картці замовлення, і майстер її підтверджує або коригує (усунення Б2.3).</w:t>
+        <w:t xml:space="preserve">Замовник описує проблему й додає фотографії. Метадані EXIF видаляються перед збереженням. Асинхронний worker-процес визначає тип несправності та формує підказку: перелік матеріалів та інструментів. Підказка відображається майстру в картці замовлення, і майстер її підтверджує або коригує (усунення Б2.3).</w:t>
       </w:r>
     </w:p>
     <w:p>
@@ -5223,7 +5223,7 @@
         <w:t xml:space="preserve"> </w:t>
       </w:r>
       <w:r>
-        <w:t xml:space="preserve">Асинхронний воркер будує граф взаємодій «замовник — майстер» (networkx), обчислює ознаки (частота відгуків за інтервал часу, взаємність оцінок, коефіцієнт кластеризації, схожість текстів за векторними представленнями) і передає їх класифікатору (scikit-learn). Підозрілі відгуки потрапляють у чергу модератора, а штраф</w:t>
+        <w:t xml:space="preserve">Асинхронний worker-процес будує граф взаємодій «замовник — майстер» (networkx), обчислює ознаки (частота відгуків за інтервал часу, взаємність оцінок, коефіцієнт кластеризації, схожість текстів за векторними представленнями) і передає їх класифікатору (scikit-learn). Підозрілі відгуки потрапляють у чергу модератора, а штраф</w:t>
       </w:r>
       <w:r>
         <w:t xml:space="preserve"> </w:t>
@@ -6082,7 +6082,7 @@
               <w:rPr>
                 <w:sz w:val="20"/>
               </w:rPr>
-              <w:t xml:space="preserve">Втрата подій = 0 при примусовому перезапуску Redis і воркера; семантика «щонайменше один раз», ідемпотентні споживачі</w:t>
+              <w:t xml:space="preserve">Втрата подій = 0 при примусовому перезапуску Redis і worker-процесу; семантика «щонайменше один раз», ідемпотентні споживачі</w:t>
             </w:r>
           </w:p>
         </w:tc>
@@ -6268,7 +6268,7 @@
               <w:rPr>
                 <w:sz w:val="20"/>
               </w:rPr>
-              <w:t xml:space="preserve">Перевірка прав доступу на 100 % захищених ендпоінтів (OWASP A01), підтверджена негативними тестами авторизації</w:t>
+              <w:t xml:space="preserve">Перевірка прав доступу на 100 % захищених кінцевих точок (OWASP A01), підтверджена негативними тестами авторизації</w:t>
             </w:r>
           </w:p>
         </w:tc>
@@ -6330,7 +6330,7 @@
               <w:rPr>
                 <w:sz w:val="20"/>
               </w:rPr>
-              <w:t xml:space="preserve">Передача даних лише через TLS 1.2+ (Nginx); обмеження частоти запитів 100 запитів/хв на IP для публічних ендпоінтів</w:t>
+              <w:t xml:space="preserve">Передача даних лише через TLS 1.2+ (Nginx); обмеження частоти запитів 100 запитів/хв на IP для публічних кінцевих точок</w:t>
             </w:r>
           </w:p>
         </w:tc>
@@ -6845,7 +6845,7 @@
               <w:rPr>
                 <w:sz w:val="20"/>
               </w:rPr>
-              <w:t xml:space="preserve">100 % ендпоінтів REST API описано специфікацією OpenAPI 3.x</w:t>
+              <w:t xml:space="preserve">100 % кінцевих точок REST API описано специфікацією OpenAPI 3.x</w:t>
             </w:r>
           </w:p>
         </w:tc>
@@ -6907,7 +6907,7 @@
               <w:rPr>
                 <w:sz w:val="20"/>
               </w:rPr>
-              <w:t xml:space="preserve">Метрики Prometheus (histogram Latency, довжина черг, Outbox lag), дашборд Grafana; сповіщення при Outbox lag &gt; 60 с</w:t>
+              <w:t xml:space="preserve">Метрики Prometheus (histogram Latency, довжина черг, Outbox lag), панель Grafana; сповіщення при Outbox lag &gt; 60 с</w:t>
             </w:r>
           </w:p>
         </w:tc>
@@ -7094,7 +7094,7 @@
         <w:pStyle w:val="BodyText"/>
       </w:pPr>
       <w:r>
-        <w:t xml:space="preserve">Обраний шлях розв’язання ґрунтується на модульному моноліті на Python/Flask з єдиним джерелом істини в PostgreSQL. Скінченний автомат замовлення з обмеженнями цілісності забезпечує допуск відгуку лише за підтвердженим замовленням. Патерн Transactional Outbox усуває проблему подвійного запису, а виконання перерахунку рейтингу й аналізу зображень у воркерах Celery виключає залежність Latency API від тривалості обчислень. Зважене байєсівське згладжування з урахуванням району та давності, доповнене графовим аналізом і ML-класифікатором, відповідає виявленим вузьким місцям Б3.1-Б3.5. Локальне виконання відкритих моделей усуває залежність від керованих хмарних API. Прийнятними обмеженнями визнано переважно вертикальне масштабування та використання Redis як недовговічного брокера, який компенсується таблицею outbox.</w:t>
+        <w:t xml:space="preserve">Обраний шлях розв’язання ґрунтується на модульному моноліті на Python/Flask з єдиним джерелом істини в PostgreSQL. Скінченний автомат замовлення з обмеженнями цілісності забезпечує допуск відгуку лише за підтвердженим замовленням. Патерн Transactional Outbox усуває проблему подвійного запису, а виконання перерахунку рейтингу й аналізу зображень у worker-процесах Celery виключає залежність Latency API від тривалості обчислень. Зважене байєсівське згладжування з урахуванням району та давності, доповнене графовим аналізом і ML-класифікатором, відповідає виявленим вузьким місцям Б3.1-Б3.5. Локальне виконання відкритих моделей усуває залежність від керованих хмарних API. Прийнятними обмеженнями визнано переважно вертикальне масштабування та використання Redis як недовговічного брокера, який компенсується таблицею outbox.</w:t>
       </w:r>
     </w:p>
     <w:p>

</xml_diff>